<commit_message>
Fix bubble chart axis clutter, add live URL, update README
- Bubble chart: replace dense log ticks with 5 explicit tick values each axis
- Bubble chart: move continent legend to right margin, no plot overlap
- Bubble chart: fix subtitle from wrong 'Cases/Fatality Rate' to actual encoding
- Add README.md with live GitHub Pages link and project overview
- Add live URL to Word doc cover page and credits table
- Live deployment: https://omerbindawood.github.io/covid-dashboard/
</commit_message>
<xml_diff>
--- a/COVID_Intelligence_Dashboard_Report.docx
+++ b/COVID_Intelligence_Dashboard_Report.docx
@@ -449,7 +449,7 @@
           <w:sz w:val="18"/>
           <w:szCs w:val="18"/>
         </w:rPr>
-        <w:t xml:space="preserve">Data Period: January 22 – July 27, 2020  |  208 Countries  |  9 Visualizations  |  D3.js v7</w:t>
+        <w:t xml:space="preserve">Live: https://omerbindawood.github.io/covid-dashboard/  |  208 Countries  |  9 Visualizations  |  D3.js v7</w:t>
       </w:r>
     </w:p>
     <w:p>
@@ -9131,6 +9131,62 @@
                 <w:szCs w:val="20"/>
               </w:rPr>
               <w:t xml:space="preserve">COVID Intelligence Dashboard</w:t>
+            </w:r>
+          </w:p>
+        </w:tc>
+      </w:tr>
+      <w:tr>
+        <w:tc>
+          <w:tcPr>
+            <w:tcW w:type="dxa" w:w="3000"/>
+            <w:tcBorders>
+              <w:top w:val="single" w:color="CCCCCC" w:sz="1"/>
+              <w:left w:val="single" w:color="CCCCCC" w:sz="1"/>
+              <w:bottom w:val="single" w:color="CCCCCC" w:sz="1"/>
+              <w:right w:val="single" w:color="CCCCCC" w:sz="1"/>
+            </w:tcBorders>
+            <w:shd w:fill="F0F4FF" w:val="clear"/>
+            <w:tcMar>
+              <w:top w:type="dxa" w:w="80"/>
+              <w:left w:type="dxa" w:w="120"/>
+              <w:bottom w:type="dxa" w:w="80"/>
+              <w:right w:type="dxa" w:w="120"/>
+            </w:tcMar>
+          </w:tcPr>
+          <w:p>
+            <w:r>
+              <w:rPr>
+                <w:sz w:val="20"/>
+                <w:szCs w:val="20"/>
+              </w:rPr>
+              <w:t xml:space="preserve">Live URL</w:t>
+            </w:r>
+          </w:p>
+        </w:tc>
+        <w:tc>
+          <w:tcPr>
+            <w:tcW w:type="dxa" w:w="6026"/>
+            <w:tcBorders>
+              <w:top w:val="single" w:color="CCCCCC" w:sz="1"/>
+              <w:left w:val="single" w:color="CCCCCC" w:sz="1"/>
+              <w:bottom w:val="single" w:color="CCCCCC" w:sz="1"/>
+              <w:right w:val="single" w:color="CCCCCC" w:sz="1"/>
+            </w:tcBorders>
+            <w:shd w:fill="F0F4FF" w:val="clear"/>
+            <w:tcMar>
+              <w:top w:type="dxa" w:w="80"/>
+              <w:left w:type="dxa" w:w="120"/>
+              <w:bottom w:type="dxa" w:w="80"/>
+              <w:right w:type="dxa" w:w="120"/>
+            </w:tcMar>
+          </w:tcPr>
+          <w:p>
+            <w:r>
+              <w:rPr>
+                <w:sz w:val="20"/>
+                <w:szCs w:val="20"/>
+              </w:rPr>
+              <w:t xml:space="preserve">https://omerbindawood.github.io/covid-dashboard/</w:t>
             </w:r>
           </w:p>
         </w:tc>

</xml_diff>